<commit_message>
Add labs of 4 term
</commit_message>
<xml_diff>
--- a/3term/Spredsheets/Report.docx
+++ b/3term/Spredsheets/Report.docx
@@ -220,63 +220,50 @@
           <w:szCs w:val="28"/>
           <w:lang w:val="en-US"/>
         </w:rPr>
-        <w:t>Your</w:t>
-      </w:r>
-      <w:r>
-        <w:rPr>
-          <w:rFonts w:ascii="Times New Roman" w:hAnsi="Times New Roman" w:cs="Times New Roman"/>
-          <w:sz w:val="28"/>
-          <w:szCs w:val="28"/>
-        </w:rPr>
-        <w:t>_</w:t>
-      </w:r>
-      <w:r>
+        <w:t>TBD</w:t>
+      </w:r>
+    </w:p>
+    <w:p>
+      <w:pPr>
+        <w:spacing w:line="360" w:lineRule="auto"/>
+        <w:ind w:left="6521"/>
+        <w:rPr>
+          <w:rFonts w:ascii="Times New Roman" w:hAnsi="Times New Roman" w:cs="Times New Roman"/>
+          <w:sz w:val="28"/>
+          <w:szCs w:val="28"/>
+        </w:rPr>
+      </w:pPr>
+      <w:r>
+        <w:rPr>
+          <w:rFonts w:ascii="Times New Roman" w:hAnsi="Times New Roman" w:cs="Times New Roman"/>
+          <w:sz w:val="28"/>
+          <w:szCs w:val="28"/>
+        </w:rPr>
+        <w:t>Проверил:</w:t>
+      </w:r>
+    </w:p>
+    <w:p>
+      <w:pPr>
+        <w:spacing w:line="360" w:lineRule="auto"/>
+        <w:ind w:left="6521"/>
         <w:rPr>
           <w:rFonts w:ascii="Times New Roman" w:hAnsi="Times New Roman" w:cs="Times New Roman"/>
           <w:sz w:val="28"/>
           <w:szCs w:val="28"/>
           <w:lang w:val="en-US"/>
         </w:rPr>
-        <w:t>Name</w:t>
-      </w:r>
-    </w:p>
-    <w:p>
-      <w:pPr>
-        <w:spacing w:line="360" w:lineRule="auto"/>
-        <w:ind w:left="6521"/>
-        <w:rPr>
-          <w:rFonts w:ascii="Times New Roman" w:hAnsi="Times New Roman" w:cs="Times New Roman"/>
-          <w:sz w:val="28"/>
-          <w:szCs w:val="28"/>
-        </w:rPr>
-      </w:pPr>
-      <w:r>
-        <w:rPr>
-          <w:rFonts w:ascii="Times New Roman" w:hAnsi="Times New Roman" w:cs="Times New Roman"/>
-          <w:sz w:val="28"/>
-          <w:szCs w:val="28"/>
-        </w:rPr>
-        <w:t>Проверил:</w:t>
-      </w:r>
-    </w:p>
-    <w:p>
-      <w:pPr>
-        <w:spacing w:line="360" w:lineRule="auto"/>
-        <w:ind w:left="6521"/>
-        <w:rPr>
-          <w:rFonts w:ascii="Times New Roman" w:hAnsi="Times New Roman" w:cs="Times New Roman"/>
-          <w:sz w:val="28"/>
-          <w:szCs w:val="28"/>
-        </w:rPr>
-      </w:pPr>
-      <w:r>
-        <w:rPr>
-          <w:rFonts w:ascii="Times New Roman" w:hAnsi="Times New Roman" w:cs="Times New Roman"/>
-          <w:sz w:val="28"/>
-          <w:szCs w:val="28"/>
-        </w:rPr>
-        <w:t>Стаховский С.М.</w:t>
-      </w:r>
+      </w:pPr>
+      <w:r>
+        <w:rPr>
+          <w:rFonts w:ascii="Times New Roman" w:hAnsi="Times New Roman" w:cs="Times New Roman"/>
+          <w:sz w:val="28"/>
+          <w:szCs w:val="28"/>
+          <w:lang w:val="en-US"/>
+        </w:rPr>
+        <w:t>TBD</w:t>
+      </w:r>
+      <w:bookmarkStart w:id="0" w:name="_GoBack"/>
+      <w:bookmarkEnd w:id="0"/>
     </w:p>
     <w:p>
       <w:pPr>
@@ -3182,8 +3169,6 @@
         </w:rPr>
         <w:t>Электронная таблица «</w:t>
       </w:r>
-      <w:bookmarkStart w:id="0" w:name="_GoBack"/>
-      <w:bookmarkEnd w:id="0"/>
       <w:r>
         <w:rPr>
           <w:rFonts w:ascii="Times New Roman" w:hAnsi="Times New Roman" w:cs="Times New Roman"/>
@@ -3868,7 +3853,7 @@
           <w:rPr>
             <w:noProof/>
           </w:rPr>
-          <w:t>10</w:t>
+          <w:t>2</w:t>
         </w:r>
         <w:r>
           <w:rPr>
@@ -6510,7 +6495,7 @@
 </file>
 
 <file path=customXml/itemProps1.xml><?xml version="1.0" encoding="utf-8"?>
-<ds:datastoreItem xmlns:ds="http://schemas.openxmlformats.org/officeDocument/2006/customXml" ds:itemID="{77CF75FF-B6A4-40AA-B38F-978F37648F25}">
+<ds:datastoreItem xmlns:ds="http://schemas.openxmlformats.org/officeDocument/2006/customXml" ds:itemID="{2585EEFB-BC0D-4BF5-A6D2-AE915269A3D9}">
   <ds:schemaRefs>
     <ds:schemaRef ds:uri="http://schemas.openxmlformats.org/officeDocument/2006/bibliography"/>
   </ds:schemaRefs>

</xml_diff>